<commit_message>
updated concept document a bit
</commit_message>
<xml_diff>
--- a/documents/Bejeweled.docx
+++ b/documents/Bejeweled.docx
@@ -160,7 +160,7 @@
         </w:numPr>
       </w:pPr>
       <w:r>
-        <w:t>Action/Timed (Bejeweled Deluxe, Bejeweled 2)</w:t>
+        <w:t>Endless/Zen</w:t>
       </w:r>
     </w:p>
     <w:p>
@@ -172,7 +172,7 @@
         </w:numPr>
       </w:pPr>
       <w:r>
-        <w:t>Endless/Zen</w:t>
+        <w:t>Original</w:t>
       </w:r>
     </w:p>
     <w:p>
@@ -184,7 +184,7 @@
         </w:numPr>
       </w:pPr>
       <w:r>
-        <w:t>Original (Bejeweled 2)</w:t>
+        <w:t>Twist</w:t>
       </w:r>
     </w:p>
     <w:p>
@@ -196,7 +196,7 @@
         </w:numPr>
       </w:pPr>
       <w:r>
-        <w:t>Twist (Bejeweled Twist)</w:t>
+        <w:t>Puzzle/Challenge/Quest</w:t>
       </w:r>
     </w:p>
     <w:p>
@@ -208,53 +208,15 @@
         </w:numPr>
       </w:pPr>
       <w:r>
-        <w:t>Puzzle/Challenge/Quest (Bejeweled 2, Bejeweled Twist, Bejeweled 3, Bejeweled Stars)</w:t>
-      </w:r>
-    </w:p>
-    <w:p>
-      <w:pPr>
-        <w:pStyle w:val="a5"/>
-        <w:numPr>
-          <w:ilvl w:val="0"/>
-          <w:numId w:val="2"/>
-        </w:numPr>
-      </w:pPr>
-      <w:r>
         <w:t>Blitz/</w:t>
       </w:r>
       <w:proofErr w:type="spellStart"/>
       <w:r>
         <w:t>Lighthing</w:t>
       </w:r>
+      <w:bookmarkStart w:id="0" w:name="_GoBack"/>
+      <w:bookmarkEnd w:id="0"/>
       <w:proofErr w:type="spellEnd"/>
-      <w:r>
-        <w:t xml:space="preserve"> (Bejeweled Twist, Bejeweled Blitz, Bejeweled 3)</w:t>
-      </w:r>
-    </w:p>
-    <w:p>
-      <w:pPr>
-        <w:pStyle w:val="a5"/>
-        <w:numPr>
-          <w:ilvl w:val="0"/>
-          <w:numId w:val="2"/>
-        </w:numPr>
-      </w:pPr>
-      <w:proofErr w:type="spellStart"/>
-      <w:r>
-        <w:t>Rubix</w:t>
-      </w:r>
-      <w:proofErr w:type="spellEnd"/>
-      <w:r>
-        <w:t xml:space="preserve"> (</w:t>
-      </w:r>
-      <w:proofErr w:type="spellStart"/>
-      <w:r>
-        <w:t>Chuzzle</w:t>
-      </w:r>
-      <w:proofErr w:type="spellEnd"/>
-      <w:r>
-        <w:t>)</w:t>
-      </w:r>
     </w:p>
     <w:p>
       <w:pPr>
@@ -341,8 +303,6 @@
       <w:r>
         <w:t>^ the funny</w:t>
       </w:r>
-      <w:bookmarkStart w:id="0" w:name="_GoBack"/>
-      <w:bookmarkEnd w:id="0"/>
     </w:p>
     <w:sectPr>
       <w:pgSz w:w="12240" w:h="15840"/>

</xml_diff>